<commit_message>
docs: add technical overview and update thesis index and chapter sections
</commit_message>
<xml_diff>
--- a/documenti/003_GeometriaIuris_Indice.docx
+++ b/documenti/003_GeometriaIuris_Indice.docx
@@ -23,7 +23,91 @@
           <w:i/>
           <w:sz w:val="26"/>
         </w:rPr>
-        <w:t>Measuring Legal Meaning Across Cultural Normative Structures</w:t>
+        <w:t xml:space="preserve">Measuring </w:t>
+      </w:r>
+      <w:r>
+        <w:rPr>
+          <w:i/>
+          <w:sz w:val="26"/>
+        </w:rPr>
+        <w:t>l</w:t>
+      </w:r>
+      <w:r>
+        <w:rPr>
+          <w:i/>
+          <w:sz w:val="26"/>
+        </w:rPr>
+        <w:t xml:space="preserve">egal </w:t>
+      </w:r>
+      <w:r>
+        <w:rPr>
+          <w:i/>
+          <w:sz w:val="26"/>
+        </w:rPr>
+        <w:t>m</w:t>
+      </w:r>
+      <w:r>
+        <w:rPr>
+          <w:i/>
+          <w:sz w:val="26"/>
+        </w:rPr>
+        <w:t xml:space="preserve">eaning </w:t>
+      </w:r>
+      <w:r>
+        <w:rPr>
+          <w:i/>
+          <w:sz w:val="26"/>
+        </w:rPr>
+        <w:t>a</w:t>
+      </w:r>
+      <w:r>
+        <w:rPr>
+          <w:i/>
+          <w:sz w:val="26"/>
+        </w:rPr>
+        <w:t xml:space="preserve">cross </w:t>
+      </w:r>
+      <w:r>
+        <w:rPr>
+          <w:i/>
+          <w:sz w:val="26"/>
+        </w:rPr>
+        <w:t>c</w:t>
+      </w:r>
+      <w:r>
+        <w:rPr>
+          <w:i/>
+          <w:sz w:val="26"/>
+        </w:rPr>
+        <w:t xml:space="preserve">ultural </w:t>
+      </w:r>
+      <w:r>
+        <w:rPr>
+          <w:i/>
+          <w:sz w:val="26"/>
+        </w:rPr>
+        <w:t>n</w:t>
+      </w:r>
+      <w:r>
+        <w:rPr>
+          <w:i/>
+          <w:sz w:val="26"/>
+        </w:rPr>
+        <w:t xml:space="preserve">ormative </w:t>
+      </w:r>
+      <w:r>
+        <w:rPr>
+          <w:i/>
+          <w:sz w:val="26"/>
+        </w:rPr>
+        <w:t>s</w:t>
+      </w:r>
+      <w:r>
+        <w:rPr>
+          <w:i/>
+          <w:sz w:val="26"/>
+        </w:rPr>
+        <w:t>tructures</w:t>
       </w:r>
     </w:p>
     <w:p>
@@ -35,7 +119,35 @@
           <w:i/>
           <w:sz w:val="26"/>
         </w:rPr>
-        <w:t>in Embedding Spaces</w:t>
+        <w:t xml:space="preserve">in </w:t>
+      </w:r>
+      <w:r>
+        <w:rPr>
+          <w:i/>
+          <w:sz w:val="26"/>
+        </w:rPr>
+        <w:t>e</w:t>
+      </w:r>
+      <w:r>
+        <w:rPr>
+          <w:i/>
+          <w:sz w:val="26"/>
+        </w:rPr>
+        <w:t xml:space="preserve">mbedding </w:t>
+      </w:r>
+      <w:r>
+        <w:rPr>
+          <w:i/>
+          <w:sz w:val="26"/>
+        </w:rPr>
+        <w:t>s</w:t>
+      </w:r>
+      <w:r>
+        <w:rPr>
+          <w:i/>
+          <w:sz w:val="26"/>
+        </w:rPr>
+        <w:t>paces</w:t>
       </w:r>
     </w:p>
     <w:p/>
@@ -307,11 +419,19 @@
         <w:spacing w:before="40"/>
         <w:ind w:left="576"/>
       </w:pPr>
+      <w:proofErr w:type="gramStart"/>
       <w:r>
         <w:rPr>
           <w:sz w:val="22"/>
         </w:rPr>
-        <w:t>3.1.3  The depth of legal meaning: at which layer does the signal crystallize?</w:t>
+        <w:t>3.1.3  The</w:t>
+      </w:r>
+      <w:proofErr w:type="gramEnd"/>
+      <w:r>
+        <w:rPr>
+          <w:sz w:val="22"/>
+        </w:rPr>
+        <w:t xml:space="preserve"> depth of legal meaning: at which layer does the signal crystallize?</w:t>
       </w:r>
     </w:p>
     <w:p>
@@ -319,12 +439,28 @@
         <w:spacing w:before="40"/>
         <w:ind w:left="576"/>
       </w:pPr>
+      <w:proofErr w:type="gramStart"/>
       <w:r>
         <w:rPr>
           <w:sz w:val="22"/>
         </w:rPr>
-        <w:t>3.1.4  Cross-tradition comparison: the correlation drop</w:t>
+        <w:t>3.1.4  Cross</w:t>
       </w:r>
+      <w:proofErr w:type="gramEnd"/>
+      <w:r>
+        <w:rPr>
+          <w:sz w:val="22"/>
+        </w:rPr>
+        <w:t xml:space="preserve">-tradition comparison: the correlation </w:t>
+      </w:r>
+      <w:proofErr w:type="gramStart"/>
+      <w:r>
+        <w:rPr>
+          <w:sz w:val="22"/>
+        </w:rPr>
+        <w:t>drop</w:t>
+      </w:r>
+      <w:proofErr w:type="gramEnd"/>
     </w:p>
     <w:p>
       <w:pPr>
@@ -334,7 +470,19 @@
         <w:rPr>
           <w:sz w:val="22"/>
         </w:rPr>
-        <w:t>3.2 Semantic neighborhoods — concepts that change context</w:t>
+        <w:t>3.2 Semantic neighborhoods</w:t>
+      </w:r>
+      <w:r>
+        <w:rPr>
+          <w:sz w:val="22"/>
+        </w:rPr>
+        <w:t>:</w:t>
+      </w:r>
+      <w:r>
+        <w:rPr>
+          <w:sz w:val="22"/>
+        </w:rPr>
+        <w:t xml:space="preserve"> concepts that change context</w:t>
       </w:r>
     </w:p>
     <w:p>
@@ -381,7 +529,19 @@
         <w:rPr>
           <w:sz w:val="22"/>
         </w:rPr>
-        <w:t>3.3 Value dimensions — the axes where traditions separate</w:t>
+        <w:t>3.3 Value dimensions</w:t>
+      </w:r>
+      <w:r>
+        <w:rPr>
+          <w:sz w:val="22"/>
+        </w:rPr>
+        <w:t>:</w:t>
+      </w:r>
+      <w:r>
+        <w:rPr>
+          <w:sz w:val="22"/>
+        </w:rPr>
+        <w:t xml:space="preserve"> the axes where traditions separate</w:t>
       </w:r>
     </w:p>
     <w:p>
@@ -446,11 +606,31 @@
       <w:pPr>
         <w:spacing w:before="40"/>
       </w:pPr>
+      <w:proofErr w:type="gramStart"/>
       <w:r>
         <w:rPr>
           <w:sz w:val="22"/>
         </w:rPr>
-        <w:t>4.1  What three experiments say together</w:t>
+        <w:t>4.1  What</w:t>
+      </w:r>
+      <w:proofErr w:type="gramEnd"/>
+      <w:r>
+        <w:rPr>
+          <w:sz w:val="22"/>
+        </w:rPr>
+        <w:t xml:space="preserve"> </w:t>
+      </w:r>
+      <w:r>
+        <w:rPr>
+          <w:sz w:val="22"/>
+        </w:rPr>
+        <w:t>the</w:t>
+      </w:r>
+      <w:r>
+        <w:rPr>
+          <w:sz w:val="22"/>
+        </w:rPr>
+        <w:t xml:space="preserve"> experiments say together</w:t>
       </w:r>
     </w:p>
     <w:p>

</xml_diff>